<commit_message>
FOVI 2026: resuelve datos respaldados por correos (año doctorado Simone, unidad UCM, grado Livia Barros)
Co-Authored-By: Claude Sonnet 5.5 <noreply@anthropic.com>
Claude-Session: https://claude.ai/code/session_01P4g3Yf3jcPuX77QSmk15pC
</commit_message>
<xml_diff>
--- a/fovi2026/FOVI2026_Formulario_INTEEGRA_v0.3.docx
+++ b/fovi2026/FOVI2026_Formulario_INTEEGRA_v0.3.docx
@@ -2785,9 +2785,7 @@
                 <w:rFonts w:ascii="Verdana" w:hAnsi="Verdana" w:cs="Verdana" w:eastAsia="Verdana"/>
                 <w:b w:val="0"/>
                 <w:sz w:val="20"/>
-                <w:highlight w:val="yellow"/>
-              </w:rPr>
-              <w:t>[CONFIRMAR unidad con M. Macaya]</w:t>
+              </w:rPr>
             </w:r>
           </w:p>
         </w:tc>
@@ -5172,9 +5170,7 @@
                 <w:rFonts w:ascii="Verdana" w:hAnsi="Verdana" w:cs="Verdana" w:eastAsia="Verdana"/>
                 <w:b w:val="0"/>
                 <w:sz w:val="20"/>
-                <w:highlight w:val="yellow"/>
-              </w:rPr>
-              <w:t>[CONFIRMAR AÑO: Simone escribió 2024 y corrigió a 2014 en correo del 1-oct]</w:t>
+              </w:rPr>
             </w:r>
             <w:r>
               <w:rPr>
@@ -8170,9 +8166,8 @@
                 <w:rFonts w:ascii="Verdana" w:hAnsi="Verdana" w:cs="Verdana" w:eastAsia="Verdana"/>
                 <w:b w:val="0"/>
                 <w:sz w:val="20"/>
-                <w:highlight w:val="yellow"/>
-              </w:rPr>
-              <w:t>[COMPLETAR]</w:t>
+              </w:rPr>
+              <w:t>Doctora</w:t>
             </w:r>
           </w:p>
         </w:tc>

</xml_diff>